<commit_message>
Plugin Claude clixite-charte (appliquer, rédiger, vérifier), styles Word nommés, note DNS Microsoft 365
Co-Authored-By: Claude Fable 5.1 <noreply@anthropic.com>
Claude-Session: https://claude.ai/code/session_01LHwojUbe5CcNLi5dx5LRLR
</commit_message>
<xml_diff>
--- a/charte/downloads/office/Clixite-modele-offre.docx
+++ b/charte/downloads/office/Clixite-modele-offre.docx
@@ -43,16 +43,10 @@
     </w:p>
     <w:p>
       <w:pPr>
-        <w:spacing w:after="40"/>
+        <w:pStyle w:val="ÉtiquetteClixite"/>
       </w:pPr>
       <w:r>
-        <w:rPr>
-          <w:rFonts w:ascii="JetBrains Mono" w:hAnsi="JetBrains Mono"/>
-          <w:b/>
-          <w:color w:val="0C7893"/>
-          <w:sz w:val="16"/>
-        </w:rPr>
-        <w:t>PROPOSITION DE SERVICES</w:t>
+        <w:t>Proposition de services</w:t>
       </w:r>
     </w:p>
     <w:p>
@@ -171,6 +165,14 @@
     <w:p>
       <w:r>
         <w:t>[Trois à cinq phrases : la situation du client, le x à résoudre, ce qui se passe si rien ne change. Chiffres et faits.]</w:t>
+      </w:r>
+    </w:p>
+    <w:p>
+      <w:pPr>
+        <w:pStyle w:val="CitationClixite"/>
+      </w:pPr>
+      <w:r>
+        <w:t>« [Une phrase du client, telle qu'il l'a dite, qui résume l'enjeu.] »</w:t>
       </w:r>
     </w:p>
     <w:p>
@@ -12858,6 +12860,47 @@
       </w:tcPr>
     </w:tblStylePr>
   </w:style>
+  <w:style w:type="paragraph" w:customStyle="1" w:styleId="ÉtiquetteClixite">
+    <w:name w:val="Étiquette Clixite"/>
+    <w:basedOn w:val="Normal"/>
+    <w:pPr>
+      <w:spacing w:after="40" w:before="240"/>
+    </w:pPr>
+    <w:rPr>
+      <w:rFonts w:ascii="JetBrains Mono" w:hAnsi="JetBrains Mono"/>
+      <w:b/>
+      <w:caps/>
+      <w:color w:val="0C7893"/>
+      <w:sz w:val="16"/>
+    </w:rPr>
+  </w:style>
+  <w:style w:type="paragraph" w:customStyle="1" w:styleId="CitationClixite">
+    <w:name w:val="Citation Clixite"/>
+    <w:basedOn w:val="Normal"/>
+    <w:pPr>
+      <w:spacing w:before="240" w:after="240"/>
+      <w:ind w:left="454"/>
+    </w:pPr>
+    <w:rPr>
+      <w:rFonts w:ascii="Fraunces" w:hAnsi="Fraunces"/>
+      <w:i/>
+      <w:color w:val="0B2239"/>
+      <w:sz w:val="30"/>
+    </w:rPr>
+  </w:style>
+  <w:style w:type="paragraph" w:customStyle="1" w:styleId="ChiffreClixite">
+    <w:name w:val="Chiffre Clixite"/>
+    <w:basedOn w:val="Normal"/>
+    <w:pPr>
+      <w:spacing w:after="0"/>
+    </w:pPr>
+    <w:rPr>
+      <w:rFonts w:ascii="Space Grotesk" w:hAnsi="Space Grotesk"/>
+      <w:b/>
+      <w:color w:val="0B2239"/>
+      <w:sz w:val="56"/>
+    </w:rPr>
+  </w:style>
 </w:styles>
 </file>
 

</xml_diff>